<commit_message>
feat(bp): v4.0 founder Kelly position, win rate, and Pre-Angel cap table
Add reproducible personal investment model for Wang Qiyuan (10M bankroll, part-time survival discount) alongside angel metrics; ship v4.0 DOCX-only business plan with 21 Python models.

Co-authored-by: Cursor <cursoragent@cursor.com>
</commit_message>
<xml_diff>
--- a/liveguard/bp_build/reference.docx
+++ b/liveguard/bp_build/reference.docx
@@ -29,9 +29,9 @@
           <w:color w:val="0B0F1A"/>
           <w:sz w:val="36"/>
         </w:rPr>
-        <w:t>直播经济的 AI 安全官</w:t>
+        <w:t>直播经济实时可信与风控中台</w:t>
         <w:br/>
-        <w:t>视频直播监控智能体 · 商业计划书 v2.0</w:t>
+        <w:t>商业计划书 v3.0 · 天使 IRR 优先</w:t>
       </w:r>
       <w:r>
         <w:br/>
@@ -44,7 +44,7 @@
           <w:sz w:val="24"/>
         </w:rPr>
         <w:br/>
-        <w:t>2026 年 05 月 31 日</w:t>
+        <w:t>2026 年 06 月 01 日</w:t>
       </w:r>
     </w:p>
     <w:sectPr>
@@ -93,7 +93,7 @@
         <w:color w:val="8A93A6"/>
         <w:sz w:val="18"/>
       </w:rPr>
-      <w:t>守播 LiveGuard AI · 商业计划书 v2.0</w:t>
+      <w:t>守播 LiveGuard AI · 商业计划书 v3.0</w:t>
     </w:r>
   </w:p>
 </w:hdr>

</xml_diff>